<commit_message>
Release ZgData Toolkit 1.3.0 printer diagnostics
</commit_message>
<xml_diff>
--- a/documentation.docx
+++ b/documentation.docx
@@ -166,7 +166,7 @@
         <w:jc w:val="center"/>
       </w:pPr>
       <w:r>
-        <w:t>Verzija dokumenta 1.2.0</w:t>
+        <w:t>Verzija dokumenta 1.3.0</w:t>
       </w:r>
     </w:p>
     <w:p>
@@ -174,7 +174,7 @@
         <w:jc w:val="center"/>
       </w:pPr>
       <w:r>
-        <w:t>Izdanje 1.2.0 - Apross Client Monitor i SQL korelacija</w:t>
+        <w:t>Izdanje 1.3.0 - Printer Diagnostics &amp; Repair</w:t>
       </w:r>
     </w:p>
     <w:p>
@@ -182,12 +182,7 @@
         <w:jc w:val="center"/>
       </w:pPr>
       <w:r>
-        <w:rPr>
-          <w:rFonts w:ascii="Aptos" w:hAnsi="Aptos"/>
-          <w:color w:val="64748B"/>
-          <w:sz w:val="19"/>
-        </w:rPr>
-        <w:t>Srpanj 2026.</w:t>
+        <w:t>Kolovoz 2026.</w:t>
       </w:r>
     </w:p>
     <w:tbl>
@@ -272,7 +267,7 @@
         <w:spacing w:before="0" w:after="100" w:line="264" w:lineRule="auto"/>
       </w:pPr>
       <w:r>
-        <w:t>ZgData Toolkit je prijenosni alat za osnovnu i proširenu provjeru internetske veze, dostupnosti ZgData servisa, usporedbu više cloud dijagnostičkih ruta, provjeru SQL TCP porta te nadzor lokalno pokrenutih aplikacija. Od verzije 1.2.0 uključen je Apross Client Monitor koji povezuje lokalni Apross proces, njegove pomoćne procese, TCP endpointove, procesne resurse i opcionalnu SQL live korelaciju u jedinstveni dijagnostički izvještaj.</w:t>
+        <w:t>ZgData Toolkit je prijenosni alat za osnovnu i proširenu provjeru internetske veze, dostupnosti ZgData servisa, usporedbu više cloud dijagnostičkih ruta, provjeru SQL TCP porta, nadzor lokalno pokrenutih aplikacija i dijagnostiku Windows print sustava. Od verzije 1.2.0 uključen je Apross Client Monitor, a od verzije 1.3.0 Printer Diagnostics &amp; Repair za provjeru printer queueova, dostupnosti mrežnih printera, print jobova, drivera i GDI/USER resursa.</w:t>
       </w:r>
     </w:p>
     <w:p>
@@ -5339,6 +5334,94 @@
     </w:p>
     <w:p>
       <w:pPr>
+        <w:pStyle w:val="ListBullet"/>
+      </w:pPr>
+      <w:r>
+        <w:t>Poboljšan kontrast Printer Diagnostics tablica i kontrola.</w:t>
+      </w:r>
+    </w:p>
+    <w:p>
+      <w:pPr>
+        <w:pStyle w:val="ListBullet"/>
+      </w:pPr>
+      <w:r>
+        <w:t>Dodan dijagnostički TEST PRINT s velikim 0/1 smileyjem; ispis koristi klasični Windows GDI print pipeline.</w:t>
+      </w:r>
+    </w:p>
+    <w:p>
+      <w:pPr>
+        <w:pStyle w:val="ListBullet"/>
+      </w:pPr>
+      <w:r>
+        <w:t>Dodan GDI/USER/handles process snapshot za brzo otkrivanje procesa s neuobičajeno visokim GUI resursima.</w:t>
+      </w:r>
+    </w:p>
+    <w:p>
+      <w:pPr>
+        <w:pStyle w:val="ListBullet"/>
+      </w:pPr>
+      <w:r>
+        <w:t>Dodan HTML printer report i akcijski log.</w:t>
+      </w:r>
+    </w:p>
+    <w:p>
+      <w:pPr>
+        <w:pStyle w:val="ListBullet"/>
+      </w:pPr>
+      <w:r>
+        <w:t>Microsoft Print to PDF može se postaviti kao default ručno ili kada je postojeći default printer nedostupan.</w:t>
+      </w:r>
+    </w:p>
+    <w:p>
+      <w:pPr>
+        <w:pStyle w:val="ListBullet"/>
+      </w:pPr>
+      <w:r>
+        <w:t>Recommended fix sigurno isključuje Windows automatic default-printer management i čuva ispravan trenutni default printer.</w:t>
+      </w:r>
+    </w:p>
+    <w:p>
+      <w:pPr>
+        <w:pStyle w:val="ListBullet"/>
+      </w:pPr>
+      <w:r>
+        <w:t>Dodana detekcija unavailable/warning stanja, problematičnih print jobova i mogućih stale/duplicate queueova.</w:t>
+      </w:r>
+    </w:p>
+    <w:p>
+      <w:pPr>
+        <w:pStyle w:val="ListBullet"/>
+      </w:pPr>
+      <w:r>
+        <w:t>Dodana provjera mrežne dostupnosti printera i odabranih print/service portova.</w:t>
+      </w:r>
+    </w:p>
+    <w:p>
+      <w:pPr>
+        <w:pStyle w:val="ListBullet"/>
+      </w:pPr>
+      <w:r>
+        <w:t>Dodan pregled instaliranih printer queueova, Windows statusa, portova, host/IP podataka i drivera.</w:t>
+      </w:r>
+    </w:p>
+    <w:p>
+      <w:pPr>
+        <w:pStyle w:val="ListBullet"/>
+      </w:pPr>
+      <w:r>
+        <w:t>Dodan Printer Diagnostics &amp; Repair modul dostupan iz glavnog ZgData Toolkita.</w:t>
+      </w:r>
+    </w:p>
+    <w:p>
+      <w:pPr>
+        <w:pStyle w:val="Heading2"/>
+      </w:pPr>
+      <w:r>
+        <w:t>Verzija 1.3.0 - Printer Diagnostics &amp; Repair (13.08.2026.)</w:t>
+      </w:r>
+    </w:p>
+    <w:p>
+      <w:pPr>
         <w:pStyle w:val="Heading2"/>
       </w:pPr>
       <w:r>
@@ -7434,6 +7517,130 @@
         <w:t>Uz HTML report pošaljite CSV datoteke, približno vrijeme problema i opis korisnikove radnje.</w:t>
       </w:r>
     </w:p>
+    <w:p>
+      <w:pPr>
+        <w:pStyle w:val="Heading1"/>
+      </w:pPr>
+      <w:r>
+        <w:t>29. Printer Diagnostics &amp; Repair</w:t>
+      </w:r>
+    </w:p>
+    <w:p>
+      <w:pPr/>
+      <w:r>
+        <w:t>Printer Diagnostics &amp; Repair služi za brzu provjeru Windows print sustava bez ručnog otvaranja više administrativnih konzola. Modul ne briše printere, drivere ni print jobove automatski. Potencijalno destruktivne akcije traže ručni odabir i potvrdu.</w:t>
+      </w:r>
+    </w:p>
+    <w:p>
+      <w:pPr>
+        <w:pStyle w:val="Heading1"/>
+      </w:pPr>
+      <w:r>
+        <w:t>30. Kako koristiti Printer Diagnostics</w:t>
+      </w:r>
+    </w:p>
+    <w:p>
+      <w:pPr>
+        <w:pStyle w:val="ListNumber"/>
+      </w:pPr>
+      <w:r>
+        <w:t>U glavnom ZgData Toolkitu kliknite PRINTER DIAGNOSTICS.</w:t>
+      </w:r>
+    </w:p>
+    <w:p>
+      <w:pPr>
+        <w:pStyle w:val="ListNumber"/>
+      </w:pPr>
+      <w:r>
+        <w:t>Kliknite SCAN PRINTERS i pričekajte završetak pregleda.</w:t>
+      </w:r>
+    </w:p>
+    <w:p>
+      <w:pPr>
+        <w:pStyle w:val="ListNumber"/>
+      </w:pPr>
+      <w:r>
+        <w:t>Provjerite Default printer, Windows manages default, Print Spooler, Unavailable / warning, Duplicate candidates i Problem print jobs.</w:t>
+      </w:r>
+    </w:p>
+    <w:p>
+      <w:pPr>
+        <w:pStyle w:val="ListNumber"/>
+      </w:pPr>
+      <w:r>
+        <w:t>U tablici pregledajte Windows status, razlog, port, Host/IP, source, ping, TCP/services, broj jobova i driver.</w:t>
+      </w:r>
+    </w:p>
+    <w:p>
+      <w:pPr>
+        <w:pStyle w:val="ListNumber"/>
+      </w:pPr>
+      <w:r>
+        <w:t>Ako Toolkit preporuči popravak, kliknite APPLY RECOMMENDED FIX i pročitajte potvrdu prije izvršenja.</w:t>
+      </w:r>
+    </w:p>
+    <w:p>
+      <w:pPr>
+        <w:pStyle w:val="ListNumber"/>
+      </w:pPr>
+      <w:r>
+        <w:t>Za fizičku provjeru printera označite queue i pokrenite TEST PRINT :) 01.</w:t>
+      </w:r>
+    </w:p>
+    <w:p>
+      <w:pPr>
+        <w:pStyle w:val="ListNumber"/>
+      </w:pPr>
+      <w:r>
+        <w:t>Po potrebi kliknite EXPORT HTML REPORT i spremite izvještaj uz ticket.</w:t>
+      </w:r>
+    </w:p>
+    <w:p>
+      <w:pPr>
+        <w:pStyle w:val="Heading1"/>
+      </w:pPr>
+      <w:r>
+        <w:t>31. Recommended fix i sigurnost</w:t>
+      </w:r>
+    </w:p>
+    <w:p>
+      <w:pPr/>
+      <w:r>
+        <w:t>Recommended fix je namjerno konzervativan. Isključuje opciju Let Windows manage my default printer za trenutačnog korisnika. Ako je postojeći default printer ispravan, ostavlja ga nepromijenjenim. Ako je default missing ili nedostupan, može postaviti Microsoft Print to PDF. Ne uklanja printer queueove, drivere ni postojeće print jobove.</w:t>
+      </w:r>
+    </w:p>
+    <w:p>
+      <w:pPr/>
+      <w:r>
+        <w:t>Mogući stale/duplicate queue prikazuje se kao kandidat za ručnu provjeru. Jednaki driver ili sličan naziv nisu sami po sebi dovoljan dokaz da queue treba obrisati.</w:t>
+      </w:r>
+    </w:p>
+    <w:p>
+      <w:pPr>
+        <w:pStyle w:val="Heading1"/>
+      </w:pPr>
+      <w:r>
+        <w:t>32. GDI / process snapshot</w:t>
+      </w:r>
+    </w:p>
+    <w:p>
+      <w:pPr/>
+      <w:r>
+        <w:t>GDI / process snapshot prikazuje procese s najvećim brojem GDI objekata, USER objekata i handleova te osnovni RAM i Responding status. Jedan snapshot je upozoravajući signal; ponovljeni rast kroz vrijeme je znatno jači dokaz curenja resursa.</w:t>
+      </w:r>
+    </w:p>
+    <w:p>
+      <w:pPr/>
+      <w:r>
+        <w:t>Windows po zadanom ograničava procese na približno 10.000 GDI i 10.000 USER GUI handleova. U nekim Apross instalacijama GDIProcessHandleQuota je administrativno povećan na 20.000 kako bi se smanjila učestalost rušenja pri visokoj potrošnji, ali povećanje limita ne uklanja uzrok eventualnog resource leaka.</w:t>
+      </w:r>
+    </w:p>
+    <w:p>
+      <w:pPr/>
+      <w:r>
+        <w:t>Za Apross probleme uz Printer Diagnostics snapshot treba koristiti i Apross Client Monitor, jer on već bilježi GDI i USER objekte kroz vrijeme zajedno s CPU/RAM, konekcijama i SQL korelacijom.</w:t>
+      </w:r>
+    </w:p>
     <w:tbl>
       <w:tblPr>
         <w:tblW w:type="auto" w:w="0"/>

</xml_diff>